<commit_message>
Template docx: centered footer with PJ Professionals | titel | versie | pagina
8pt light grey, bound title/versie fields mirror the cover page live.

Co-Authored-By: Claude Sonnet 5 <noreply@anthropic.com>
</commit_message>
<xml_diff>
--- a/documenten/Template PJ Professionals BV.docx
+++ b/documenten/Template PJ Professionals BV.docx
@@ -24,7 +24,7 @@
             <w:docPart w:val="DefaultPlaceholder1234567"/>
           </w:placeholder>
           <w:showingPlcHdr/>
-          <w:dataBinding w:prefixMappings="xmlns:ns0='urn:pj-professionals:template'" w:xpath="/ns0:root[1]/ns0:titel[1]" w:storeItemID="{E36A84E1-7C7E-4B77-B645-B47942117AA1}"/>
+          <w:dataBinding w:prefixMappings="xmlns:ns0='urn:pj-professionals:template'" w:xpath="/ns0:root[1]/ns0:titel[1]" w:storeItemID="{CA8FDC65-C238-4763-AF3D-426E2554CF60}"/>
           <w:text w:multiLine="0"/>
         </w:sdtPr>
         <w:sdtEndPr/>
@@ -63,7 +63,7 @@
             <w:docPart w:val="DefaultPlaceholder1234567"/>
           </w:placeholder>
           <w:showingPlcHdr/>
-          <w:dataBinding w:prefixMappings="xmlns:ns0='urn:pj-professionals:template'" w:xpath="/ns0:root[1]/ns0:subtitel[1]" w:storeItemID="{E36A84E1-7C7E-4B77-B645-B47942117AA1}"/>
+          <w:dataBinding w:prefixMappings="xmlns:ns0='urn:pj-professionals:template'" w:xpath="/ns0:root[1]/ns0:subtitel[1]" w:storeItemID="{CA8FDC65-C238-4763-AF3D-426E2554CF60}"/>
           <w:text w:multiLine="0"/>
         </w:sdtPr>
         <w:sdtEndPr/>
@@ -110,7 +110,7 @@
             <w:docPart w:val="DefaultPlaceholder1234567"/>
           </w:placeholder>
           <w:showingPlcHdr/>
-          <w:dataBinding w:prefixMappings="xmlns:ns0='urn:pj-professionals:template'" w:xpath="/ns0:root[1]/ns0:versienummer[1]" w:storeItemID="{E36A84E1-7C7E-4B77-B645-B47942117AA1}"/>
+          <w:dataBinding w:prefixMappings="xmlns:ns0='urn:pj-professionals:template'" w:xpath="/ns0:root[1]/ns0:versienummer[1]" w:storeItemID="{CA8FDC65-C238-4763-AF3D-426E2554CF60}"/>
           <w:text w:multiLine="0"/>
         </w:sdtPr>
         <w:sdtEndPr/>
@@ -157,7 +157,7 @@
             <w:docPart w:val="DefaultPlaceholder1234567"/>
           </w:placeholder>
           <w:showingPlcHdr/>
-          <w:dataBinding w:prefixMappings="xmlns:ns0='urn:pj-professionals:template'" w:xpath="/ns0:root[1]/ns0:versiedatum[1]" w:storeItemID="{E36A84E1-7C7E-4B77-B645-B47942117AA1}"/>
+          <w:dataBinding w:prefixMappings="xmlns:ns0='urn:pj-professionals:template'" w:xpath="/ns0:root[1]/ns0:versiedatum[1]" w:storeItemID="{CA8FDC65-C238-4763-AF3D-426E2554CF60}"/>
           <w:text w:multiLine="0"/>
         </w:sdtPr>
         <w:sdtEndPr/>
@@ -204,7 +204,7 @@
             <w:docPart w:val="DefaultPlaceholder1234567"/>
           </w:placeholder>
           <w:showingPlcHdr/>
-          <w:dataBinding w:prefixMappings="xmlns:ns0='urn:pj-professionals:template'" w:xpath="/ns0:root[1]/ns0:documenteigenaar[1]" w:storeItemID="{E36A84E1-7C7E-4B77-B645-B47942117AA1}"/>
+          <w:dataBinding w:prefixMappings="xmlns:ns0='urn:pj-professionals:template'" w:xpath="/ns0:root[1]/ns0:documenteigenaar[1]" w:storeItemID="{CA8FDC65-C238-4763-AF3D-426E2554CF60}"/>
           <w:text w:multiLine="0"/>
         </w:sdtPr>
         <w:sdtEndPr/>
@@ -361,17 +361,33 @@
 <w:ftr xmlns:wpc="http://schemas.microsoft.com/office/word/2010/wordprocessingCanvas" xmlns:mc="http://schemas.openxmlformats.org/markup-compatibility/2006" xmlns:o="urn:schemas-microsoft-com:office:office" xmlns:r="http://schemas.openxmlformats.org/officeDocument/2006/relationships" xmlns:m="http://schemas.openxmlformats.org/officeDocument/2006/math" xmlns:v="urn:schemas-microsoft-com:vml" xmlns:wp14="http://schemas.microsoft.com/office/word/2010/wordprocessingDrawing" xmlns:wp="http://schemas.openxmlformats.org/drawingml/2006/wordprocessingDrawing" xmlns:w10="urn:schemas-microsoft-com:office:word" xmlns:w="http://schemas.openxmlformats.org/wordprocessingml/2006/main" xmlns:w14="http://schemas.microsoft.com/office/word/2010/wordml" xmlns:w15="http://schemas.microsoft.com/office/word/2012/wordml" xmlns:wpg="http://schemas.microsoft.com/office/word/2010/wordprocessingGroup" xmlns:wpi="http://schemas.microsoft.com/office/word/2010/wordprocessingInk" xmlns:wne="http://schemas.microsoft.com/office/word/2006/wordml" xmlns:wps="http://schemas.microsoft.com/office/word/2010/wordprocessingShape" mc:Ignorable="w14">
   <w:p>
     <w:pPr>
-      <w:tabs>
-        <w:tab w:val="right" w:pos="9306"/>
-      </w:tabs>
+      <w:jc w:val="center"/>
     </w:pPr>
+    <w:r>
+      <w:rPr>
+        <w:rFonts w:ascii="DM Sans" w:cs="DM Sans" w:eastAsia="DM Sans" w:hAnsi="DM Sans"/>
+        <w:color w:val="999999"/>
+        <w:sz w:val="16"/>
+        <w:szCs w:val="16"/>
+      </w:rPr>
+      <w:t xml:space="preserve">PJ Professionals</w:t>
+    </w:r>
+    <w:r>
+      <w:rPr>
+        <w:rFonts w:ascii="DM Sans" w:cs="DM Sans" w:eastAsia="DM Sans" w:hAnsi="DM Sans"/>
+        <w:color w:val="999999"/>
+        <w:sz w:val="16"/>
+        <w:szCs w:val="16"/>
+      </w:rPr>
+      <w:t xml:space="preserve">  |  </w:t>
+    </w:r>
     <w:sdt>
       <w:sdtPr>
         <w:rPr>
           <w:rFonts w:ascii="DM Sans" w:cs="DM Sans" w:eastAsia="DM Sans" w:hAnsi="DM Sans"/>
-          <w:color w:val="5A6B78"/>
-          <w:sz w:val="15"/>
-          <w:szCs w:val="15"/>
+          <w:color w:val="999999"/>
+          <w:sz w:val="16"/>
+          <w:szCs w:val="16"/>
         </w:rPr>
         <w:alias w:val="footer_titel"/>
         <w:tag w:val="footer_titel"/>
@@ -380,7 +396,7 @@
           <w:docPart w:val="DefaultPlaceholder1234567"/>
         </w:placeholder>
         <w:showingPlcHdr/>
-        <w:dataBinding w:prefixMappings="xmlns:ns0='urn:pj-professionals:template'" w:xpath="/ns0:root[1]/ns0:titel[1]" w:storeItemID="{E36A84E1-7C7E-4B77-B645-B47942117AA1}"/>
+        <w:dataBinding w:prefixMappings="xmlns:ns0='urn:pj-professionals:template'" w:xpath="/ns0:root[1]/ns0:titel[1]" w:storeItemID="{CA8FDC65-C238-4763-AF3D-426E2554CF60}"/>
         <w:text w:multiLine="0"/>
       </w:sdtPr>
       <w:sdtEndPr/>
@@ -391,8 +407,8 @@
             <w:i/>
             <w:iCs/>
             <w:color w:val="6D8A99"/>
-            <w:sz w:val="15"/>
-            <w:szCs w:val="15"/>
+            <w:sz w:val="16"/>
+            <w:szCs w:val="16"/>
           </w:rPr>
           <w:t xml:space="preserve">Titel</w:t>
         </w:r>
@@ -401,19 +417,28 @@
     <w:r>
       <w:rPr>
         <w:rFonts w:ascii="DM Sans" w:cs="DM Sans" w:eastAsia="DM Sans" w:hAnsi="DM Sans"/>
-        <w:color w:val="5A6B78"/>
-        <w:sz w:val="15"/>
-        <w:szCs w:val="15"/>
+        <w:color w:val="999999"/>
+        <w:sz w:val="16"/>
+        <w:szCs w:val="16"/>
       </w:rPr>
-      <w:t xml:space="preserve">  ·  Versie </w:t>
+      <w:t xml:space="preserve">  |  </w:t>
+    </w:r>
+    <w:r>
+      <w:rPr>
+        <w:rFonts w:ascii="DM Sans" w:cs="DM Sans" w:eastAsia="DM Sans" w:hAnsi="DM Sans"/>
+        <w:color w:val="999999"/>
+        <w:sz w:val="16"/>
+        <w:szCs w:val="16"/>
+      </w:rPr>
+      <w:t xml:space="preserve">versie </w:t>
     </w:r>
     <w:sdt>
       <w:sdtPr>
         <w:rPr>
           <w:rFonts w:ascii="DM Sans" w:cs="DM Sans" w:eastAsia="DM Sans" w:hAnsi="DM Sans"/>
-          <w:color w:val="5A6B78"/>
-          <w:sz w:val="15"/>
-          <w:szCs w:val="15"/>
+          <w:color w:val="999999"/>
+          <w:sz w:val="16"/>
+          <w:szCs w:val="16"/>
         </w:rPr>
         <w:alias w:val="footer_versienummer"/>
         <w:tag w:val="footer_versienummer"/>
@@ -422,7 +447,7 @@
           <w:docPart w:val="DefaultPlaceholder1234567"/>
         </w:placeholder>
         <w:showingPlcHdr/>
-        <w:dataBinding w:prefixMappings="xmlns:ns0='urn:pj-professionals:template'" w:xpath="/ns0:root[1]/ns0:versienummer[1]" w:storeItemID="{E36A84E1-7C7E-4B77-B645-B47942117AA1}"/>
+        <w:dataBinding w:prefixMappings="xmlns:ns0='urn:pj-professionals:template'" w:xpath="/ns0:root[1]/ns0:versienummer[1]" w:storeItemID="{CA8FDC65-C238-4763-AF3D-426E2554CF60}"/>
         <w:text w:multiLine="0"/>
       </w:sdtPr>
       <w:sdtEndPr/>
@@ -433,8 +458,8 @@
             <w:i/>
             <w:iCs/>
             <w:color w:val="6D8A99"/>
-            <w:sz w:val="15"/>
-            <w:szCs w:val="15"/>
+            <w:sz w:val="16"/>
+            <w:szCs w:val="16"/>
           </w:rPr>
           <w:t xml:space="preserve">X</w:t>
         </w:r>
@@ -443,60 +468,27 @@
     <w:r>
       <w:rPr>
         <w:rFonts w:ascii="DM Sans" w:cs="DM Sans" w:eastAsia="DM Sans" w:hAnsi="DM Sans"/>
-        <w:color w:val="5A6B78"/>
-        <w:sz w:val="15"/>
-        <w:szCs w:val="15"/>
+        <w:color w:val="999999"/>
+        <w:sz w:val="16"/>
+        <w:szCs w:val="16"/>
       </w:rPr>
-      <w:t xml:space="preserve">  ·  </w:t>
-    </w:r>
-    <w:sdt>
-      <w:sdtPr>
-        <w:rPr>
-          <w:rFonts w:ascii="DM Sans" w:cs="DM Sans" w:eastAsia="DM Sans" w:hAnsi="DM Sans"/>
-          <w:color w:val="5A6B78"/>
-          <w:sz w:val="15"/>
-          <w:szCs w:val="15"/>
-        </w:rPr>
-        <w:alias w:val="footer_versiedatum"/>
-        <w:tag w:val="footer_versiedatum"/>
-        <w:id w:val="3009"/>
-        <w:placeholder>
-          <w:docPart w:val="DefaultPlaceholder1234567"/>
-        </w:placeholder>
-        <w:showingPlcHdr/>
-        <w:dataBinding w:prefixMappings="xmlns:ns0='urn:pj-professionals:template'" w:xpath="/ns0:root[1]/ns0:versiedatum[1]" w:storeItemID="{E36A84E1-7C7E-4B77-B645-B47942117AA1}"/>
-        <w:text w:multiLine="0"/>
-      </w:sdtPr>
-      <w:sdtEndPr/>
-      <w:sdtContent>
-        <w:r>
-          <w:rPr>
-            <w:rFonts w:ascii="DM Sans" w:cs="DM Sans" w:eastAsia="DM Sans" w:hAnsi="DM Sans"/>
-            <w:i/>
-            <w:iCs/>
-            <w:color w:val="6D8A99"/>
-            <w:sz w:val="15"/>
-            <w:szCs w:val="15"/>
-          </w:rPr>
-          <w:t xml:space="preserve">Dag / Maand voluit / Jaar</w:t>
-        </w:r>
-      </w:sdtContent>
-    </w:sdt>
+      <w:t xml:space="preserve">  |  </w:t>
+    </w:r>
     <w:r>
       <w:rPr>
         <w:rFonts w:ascii="DM Sans" w:cs="DM Sans" w:eastAsia="DM Sans" w:hAnsi="DM Sans"/>
-        <w:color w:val="5A6B78"/>
-        <w:sz w:val="15"/>
-        <w:szCs w:val="15"/>
+        <w:color w:val="999999"/>
+        <w:sz w:val="16"/>
+        <w:szCs w:val="16"/>
       </w:rPr>
-      <w:t xml:space="preserve">	Pagina </w:t>
+      <w:t xml:space="preserve">pagina </w:t>
     </w:r>
     <w:r>
       <w:rPr>
         <w:rFonts w:ascii="DM Sans" w:cs="DM Sans" w:eastAsia="DM Sans" w:hAnsi="DM Sans"/>
-        <w:color w:val="5A6B78"/>
-        <w:sz w:val="15"/>
-        <w:szCs w:val="15"/>
+        <w:color w:val="999999"/>
+        <w:sz w:val="16"/>
+        <w:szCs w:val="16"/>
       </w:rPr>
       <w:fldChar w:fldCharType="begin"/>
       <w:instrText xml:space="preserve">PAGE</w:instrText>
@@ -506,18 +498,18 @@
     <w:r>
       <w:rPr>
         <w:rFonts w:ascii="DM Sans" w:cs="DM Sans" w:eastAsia="DM Sans" w:hAnsi="DM Sans"/>
-        <w:color w:val="5A6B78"/>
-        <w:sz w:val="15"/>
-        <w:szCs w:val="15"/>
+        <w:color w:val="999999"/>
+        <w:sz w:val="16"/>
+        <w:szCs w:val="16"/>
       </w:rPr>
       <w:t xml:space="preserve"> van </w:t>
     </w:r>
     <w:r>
       <w:rPr>
         <w:rFonts w:ascii="DM Sans" w:cs="DM Sans" w:eastAsia="DM Sans" w:hAnsi="DM Sans"/>
-        <w:color w:val="5A6B78"/>
-        <w:sz w:val="15"/>
-        <w:szCs w:val="15"/>
+        <w:color w:val="999999"/>
+        <w:sz w:val="16"/>
+        <w:szCs w:val="16"/>
       </w:rPr>
       <w:fldChar w:fldCharType="begin"/>
       <w:instrText xml:space="preserve">NUMPAGES</w:instrText>
@@ -961,7 +953,7 @@
 </file>
 
 <file path=customXml/itemProps1.xml><?xml version="1.0" encoding="utf-8"?>
-<ds:datastoreItem xmlns:ds="http://schemas.openxmlformats.org/officeDocument/2006/customXml" ds:itemID="{E36A84E1-7C7E-4B77-B645-B47942117AA1}">
+<ds:datastoreItem xmlns:ds="http://schemas.openxmlformats.org/officeDocument/2006/customXml" ds:itemID="{CA8FDC65-C238-4763-AF3D-426E2554CF60}">
   <ds:schemaRefs>
     <ds:schemaRef ds:uri="urn:pj-professionals:template"/>
   </ds:schemaRefs>

</xml_diff>

<commit_message>
Template docx: no-footer backdrop, bigger 1-page field, locked documenteigenaar
Body page backdrop swapped to the address-free art (bottom margin
2300->900 twips, no legal text to clear). Field grown to fill the page,
sized with a real safety buffer after Word (not just LibreOffice)
overflowed onto a blank 3rd page at a tighter fit. Documenteigenaar on
the cover is now fixed "PJ Professionals" text, not a fill field.

Co-Authored-By: Claude Sonnet 5 <noreply@anthropic.com>
</commit_message>
<xml_diff>
--- a/documenten/Template PJ Professionals BV.docx
+++ b/documenten/Template PJ Professionals BV.docx
@@ -24,7 +24,7 @@
             <w:docPart w:val="DefaultPlaceholder1234567"/>
           </w:placeholder>
           <w:showingPlcHdr/>
-          <w:dataBinding w:prefixMappings="xmlns:ns0='urn:pj-professionals:template'" w:xpath="/ns0:root[1]/ns0:titel[1]" w:storeItemID="{CA8FDC65-C238-4763-AF3D-426E2554CF60}"/>
+          <w:dataBinding w:prefixMappings="xmlns:ns0='urn:pj-professionals:template'" w:xpath="/ns0:root[1]/ns0:titel[1]" w:storeItemID="{6A854858-2DB3-49FC-A50D-E6C3EC175990}"/>
           <w:text w:multiLine="0"/>
         </w:sdtPr>
         <w:sdtEndPr/>
@@ -63,7 +63,7 @@
             <w:docPart w:val="DefaultPlaceholder1234567"/>
           </w:placeholder>
           <w:showingPlcHdr/>
-          <w:dataBinding w:prefixMappings="xmlns:ns0='urn:pj-professionals:template'" w:xpath="/ns0:root[1]/ns0:subtitel[1]" w:storeItemID="{CA8FDC65-C238-4763-AF3D-426E2554CF60}"/>
+          <w:dataBinding w:prefixMappings="xmlns:ns0='urn:pj-professionals:template'" w:xpath="/ns0:root[1]/ns0:subtitel[1]" w:storeItemID="{6A854858-2DB3-49FC-A50D-E6C3EC175990}"/>
           <w:text w:multiLine="0"/>
         </w:sdtPr>
         <w:sdtEndPr/>
@@ -110,7 +110,7 @@
             <w:docPart w:val="DefaultPlaceholder1234567"/>
           </w:placeholder>
           <w:showingPlcHdr/>
-          <w:dataBinding w:prefixMappings="xmlns:ns0='urn:pj-professionals:template'" w:xpath="/ns0:root[1]/ns0:versienummer[1]" w:storeItemID="{CA8FDC65-C238-4763-AF3D-426E2554CF60}"/>
+          <w:dataBinding w:prefixMappings="xmlns:ns0='urn:pj-professionals:template'" w:xpath="/ns0:root[1]/ns0:versienummer[1]" w:storeItemID="{6A854858-2DB3-49FC-A50D-E6C3EC175990}"/>
           <w:text w:multiLine="0"/>
         </w:sdtPr>
         <w:sdtEndPr/>
@@ -157,7 +157,7 @@
             <w:docPart w:val="DefaultPlaceholder1234567"/>
           </w:placeholder>
           <w:showingPlcHdr/>
-          <w:dataBinding w:prefixMappings="xmlns:ns0='urn:pj-professionals:template'" w:xpath="/ns0:root[1]/ns0:versiedatum[1]" w:storeItemID="{CA8FDC65-C238-4763-AF3D-426E2554CF60}"/>
+          <w:dataBinding w:prefixMappings="xmlns:ns0='urn:pj-professionals:template'" w:xpath="/ns0:root[1]/ns0:versiedatum[1]" w:storeItemID="{6A854858-2DB3-49FC-A50D-E6C3EC175990}"/>
           <w:text w:multiLine="0"/>
         </w:sdtPr>
         <w:sdtEndPr/>
@@ -189,39 +189,15 @@
         </w:rPr>
         <w:t xml:space="preserve">Documenteigenaar: </w:t>
       </w:r>
-      <w:sdt>
-        <w:sdtPr>
-          <w:rPr>
-            <w:rFonts w:ascii="DM Sans" w:cs="DM Sans" w:eastAsia="DM Sans" w:hAnsi="DM Sans"/>
-            <w:color w:val="1A1A1A"/>
-            <w:sz w:val="20"/>
-            <w:szCs w:val="20"/>
-          </w:rPr>
-          <w:alias w:val="documenteigenaar"/>
-          <w:tag w:val="documenteigenaar"/>
-          <w:id w:val="3005"/>
-          <w:placeholder>
-            <w:docPart w:val="DefaultPlaceholder1234567"/>
-          </w:placeholder>
-          <w:showingPlcHdr/>
-          <w:dataBinding w:prefixMappings="xmlns:ns0='urn:pj-professionals:template'" w:xpath="/ns0:root[1]/ns0:documenteigenaar[1]" w:storeItemID="{CA8FDC65-C238-4763-AF3D-426E2554CF60}"/>
-          <w:text w:multiLine="0"/>
-        </w:sdtPr>
-        <w:sdtEndPr/>
-        <w:sdtContent>
-          <w:r>
-            <w:rPr>
-              <w:rFonts w:ascii="DM Sans" w:cs="DM Sans" w:eastAsia="DM Sans" w:hAnsi="DM Sans"/>
-              <w:i/>
-              <w:iCs/>
-              <w:color w:val="6D8A99"/>
-              <w:sz w:val="20"/>
-              <w:szCs w:val="20"/>
-            </w:rPr>
-            <w:t xml:space="preserve">PJ Professionals</w:t>
-          </w:r>
-        </w:sdtContent>
-      </w:sdt>
+      <w:r>
+        <w:rPr>
+          <w:rFonts w:ascii="DM Sans" w:cs="DM Sans" w:eastAsia="DM Sans" w:hAnsi="DM Sans"/>
+          <w:color w:val="1A1A1A"/>
+          <w:sz w:val="20"/>
+          <w:szCs w:val="20"/>
+        </w:rPr>
+        <w:t xml:space="preserve">PJ Professionals</w:t>
+      </w:r>
     </w:p>
     <w:p>
       <w:pPr>
@@ -251,7 +227,7 @@
       </w:tblGrid>
       <w:tr>
         <w:trPr>
-          <w:trHeight w:val="11000" w:hRule="atLeast"/>
+          <w:trHeight w:val="11500" w:hRule="atLeast"/>
         </w:trPr>
         <w:tc>
           <w:tcPr>
@@ -278,7 +254,7 @@
                 </w:rPr>
                 <w:alias w:val="bericht"/>
                 <w:tag w:val="bericht"/>
-                <w:id w:val="3006"/>
+                <w:id w:val="3005"/>
                 <w:placeholder>
                   <w:docPart w:val="DefaultPlaceholder1234567"/>
                 </w:placeholder>
@@ -308,7 +284,7 @@
       <w:headerReference w:type="default" r:id="rId8"/>
       <w:footerReference w:type="default" r:id="rId9"/>
       <w:pgSz w:w="11906" w:h="16838" w:orient="portrait"/>
-      <w:pgMar w:top="2500" w:right="1300" w:bottom="2300" w:left="1300" w:header="708" w:footer="1850" w:gutter="0"/>
+      <w:pgMar w:top="2500" w:right="1300" w:bottom="900" w:left="1300" w:header="708" w:footer="708" w:gutter="0"/>
       <w:pgNumType/>
       <w:docGrid w:linePitch="360"/>
     </w:sectPr>
@@ -391,12 +367,12 @@
         </w:rPr>
         <w:alias w:val="footer_titel"/>
         <w:tag w:val="footer_titel"/>
-        <w:id w:val="3007"/>
+        <w:id w:val="3006"/>
         <w:placeholder>
           <w:docPart w:val="DefaultPlaceholder1234567"/>
         </w:placeholder>
         <w:showingPlcHdr/>
-        <w:dataBinding w:prefixMappings="xmlns:ns0='urn:pj-professionals:template'" w:xpath="/ns0:root[1]/ns0:titel[1]" w:storeItemID="{CA8FDC65-C238-4763-AF3D-426E2554CF60}"/>
+        <w:dataBinding w:prefixMappings="xmlns:ns0='urn:pj-professionals:template'" w:xpath="/ns0:root[1]/ns0:titel[1]" w:storeItemID="{6A854858-2DB3-49FC-A50D-E6C3EC175990}"/>
         <w:text w:multiLine="0"/>
       </w:sdtPr>
       <w:sdtEndPr/>
@@ -442,12 +418,12 @@
         </w:rPr>
         <w:alias w:val="footer_versienummer"/>
         <w:tag w:val="footer_versienummer"/>
-        <w:id w:val="3008"/>
+        <w:id w:val="3007"/>
         <w:placeholder>
           <w:docPart w:val="DefaultPlaceholder1234567"/>
         </w:placeholder>
         <w:showingPlcHdr/>
-        <w:dataBinding w:prefixMappings="xmlns:ns0='urn:pj-professionals:template'" w:xpath="/ns0:root[1]/ns0:versienummer[1]" w:storeItemID="{CA8FDC65-C238-4763-AF3D-426E2554CF60}"/>
+        <w:dataBinding w:prefixMappings="xmlns:ns0='urn:pj-professionals:template'" w:xpath="/ns0:root[1]/ns0:versienummer[1]" w:storeItemID="{6A854858-2DB3-49FC-A50D-E6C3EC175990}"/>
         <w:text w:multiLine="0"/>
       </w:sdtPr>
       <w:sdtEndPr/>
@@ -948,12 +924,11 @@
   <ns0:subtitel/>
   <ns0:versienummer/>
   <ns0:versiedatum/>
-  <ns0:documenteigenaar/>
 </ns0:root>
 </file>
 
 <file path=customXml/itemProps1.xml><?xml version="1.0" encoding="utf-8"?>
-<ds:datastoreItem xmlns:ds="http://schemas.openxmlformats.org/officeDocument/2006/customXml" ds:itemID="{CA8FDC65-C238-4763-AF3D-426E2554CF60}">
+<ds:datastoreItem xmlns:ds="http://schemas.openxmlformats.org/officeDocument/2006/customXml" ds:itemID="{6A854858-2DB3-49FC-A50D-E6C3EC175990}">
   <ds:schemaRefs>
     <ds:schemaRef ds:uri="urn:pj-professionals:template"/>
   </ds:schemaRefs>

</xml_diff>

<commit_message>
Template docx: remove printed field border
Same fix as the Briefpapier files -- the open text field was a real
bordered table (light-blue outline) that baked into print, not Word's
own non-printing content-control hint.

Co-Authored-By: Claude Sonnet 5 <noreply@anthropic.com>
</commit_message>
<xml_diff>
--- a/documenten/Template PJ Professionals BV.docx
+++ b/documenten/Template PJ Professionals BV.docx
@@ -214,10 +214,10 @@
       <w:tblPr>
         <w:tblW w:type="pct" w:w="100%"/>
         <w:tblBorders>
-          <w:top w:val="single" w:color="BFD8E3" w:sz="4"/>
-          <w:left w:val="single" w:color="BFD8E3" w:sz="4"/>
-          <w:bottom w:val="single" w:color="BFD8E3" w:sz="4"/>
-          <w:right w:val="single" w:color="BFD8E3" w:sz="4"/>
+          <w:top w:val="none" w:color="FFFFFF" w:sz="0"/>
+          <w:left w:val="none" w:color="FFFFFF" w:sz="0"/>
+          <w:bottom w:val="none" w:color="FFFFFF" w:sz="0"/>
+          <w:right w:val="none" w:color="FFFFFF" w:sz="0"/>
           <w:insideH w:val="none" w:color="FFFFFF" w:sz="0"/>
           <w:insideV w:val="none" w:color="FFFFFF" w:sz="0"/>
         </w:tblBorders>

</xml_diff>